<commit_message>
Update CV with current research and poster
</commit_message>
<xml_diff>
--- a/data/Yongmeng_Wu_CV.docx
+++ b/data/Yongmeng_Wu_CV.docx
@@ -474,20 +474,6 @@
     <w:p>
       <w:pPr>
         <w:pStyle w:val="Body"/>
-        <w:tabs>
-          <w:tab w:val="right" w:pos="10086"/>
-        </w:tabs>
-        <w:rPr>
-          <w:rFonts w:ascii="Times New Roman" w:hAnsi="Times New Roman" w:cs="Times New Roman"/>
-          <w:color w:val="auto"/>
-          <w:sz w:val="22"/>
-          <w:szCs w:val="22"/>
-        </w:rPr>
-      </w:pPr>
-    </w:p>
-    <w:p>
-      <w:pPr>
-        <w:pStyle w:val="Body"/>
         <w:keepNext/>
         <w:pBdr>
           <w:bottom w:val="single" w:sz="6" w:space="1" w:color="000000"/>
@@ -684,7 +670,7 @@
           <w:sz w:val="22"/>
           <w:szCs w:val="22"/>
         </w:rPr>
-        <w:t>Built a GPU-resident JAX solver coupling finite element and neural operator (Transolver) subdomains via non-overlapping Neumann–Dirichlet domain decomposition</w:t>
+        <w:t>Built a GPU-accelerated JAX solver coupling finite element and neural operator (Transolver) subdomains via non-overlapping Neumann–Dirichlet domain decomposition</w:t>
       </w:r>
       <w:r>
         <w:rPr>
@@ -787,7 +773,7 @@
           <w:sz w:val="22"/>
           <w:szCs w:val="22"/>
         </w:rPr>
-        <w:t>Validated on three elastic cases (2D cylinder, 3D bracket, and a 3D composite with all 100 fiber subdomains replaced by a neural operator); now extending to path-dependent plasticity in a bolted-joint benchmark (Mota et al., IJNME 2022).</w:t>
+        <w:t>Validated on elastic benchmarks up to a 3D composite with all 100 fiber subdomains replaced by a neural operator; extended to a J2-plastic bolted joint under cyclic loading.</w:t>
       </w:r>
       <w:r>
         <w:rPr>
@@ -798,7 +784,6 @@
           <w:sz w:val="22"/>
           <w:szCs w:val="22"/>
         </w:rPr>
-        <w:t xml:space="preserve"> </w:t>
       </w:r>
     </w:p>
     <w:p>
@@ -963,7 +948,7 @@
           <w:sz w:val="22"/>
           <w:szCs w:val="22"/>
         </w:rPr>
-        <w:t>Ported the Moulinec–Suquet FFT homogenization solver to JAX for batched GPU data generation; a 2D Transolver pilot closely reproduces FE² on a macroscale beam. Extending to path-dependent plasticity.</w:t>
+        <w:t>Ported Moulinec–Suquet FFT homogenization to JAX for batched GPU data generation; CNO is the most accurate architecture in current tests. Extending to path-dependent plasticity.</w:t>
       </w:r>
     </w:p>
     <w:p>
@@ -1023,7 +1008,7 @@
           <w:sz w:val="22"/>
           <w:szCs w:val="22"/>
         </w:rPr>
-        <w:t xml:space="preserve">                          </w:t>
+        <w:tab/>
       </w:r>
       <w:r>
         <w:rPr>
@@ -1352,6 +1337,68 @@
       </w:pPr>
       <w:r>
         <w:rPr>
+          <w:rFonts w:ascii="Times New Roman" w:hAnsi="Times New Roman"/>
+          <w:b/>
+          <w:sz w:val="22"/>
+        </w:rPr>
+        <w:t>Poster Presentation</w:t>
+      </w:r>
+      <w:r>
+        <w:rPr>
+          <w:rFonts w:ascii="Times New Roman" w:hAnsi="Times New Roman"/>
+          <w:b w:val="0"/>
+          <w:sz w:val="22"/>
+        </w:rPr>
+        <w:t>, IDIES Annual Symposium, Johns Hopkins University</w:t>
+      </w:r>
+      <w:r>
+        <w:rPr>
+          <w:rFonts w:ascii="Times New Roman" w:hAnsi="Times New Roman"/>
+          <w:b w:val="0"/>
+          <w:sz w:val="22"/>
+        </w:rPr>
+        <w:tab/>
+        <w:t>Oct 2026</w:t>
+      </w:r>
+    </w:p>
+    <w:p>
+      <w:pPr>
+        <w:pStyle w:val="Body"/>
+        <w:tabs>
+          <w:tab w:val="right" w:pos="10086"/>
+        </w:tabs>
+        <w:rPr>
+          <w:rFonts w:ascii="Times New Roman" w:hAnsi="Times New Roman" w:cs="Times New Roman"/>
+          <w:color w:val="auto"/>
+          <w:sz w:val="22"/>
+          <w:szCs w:val="22"/>
+        </w:rPr>
+      </w:pPr>
+      <w:r>
+        <w:rPr>
+          <w:rFonts w:ascii="Times New Roman" w:hAnsi="Times New Roman"/>
+          <w:i/>
+          <w:sz w:val="22"/>
+        </w:rPr>
+        <w:t>Plug-in Neural Subdomains: FE–NO Coupling in 3D</w:t>
+      </w:r>
+    </w:p>
+    <w:p>
+      <w:pPr>
+        <w:pStyle w:val="Body"/>
+        <w:keepNext/>
+        <w:tabs>
+          <w:tab w:val="right" w:pos="10086"/>
+        </w:tabs>
+        <w:rPr>
+          <w:rFonts w:ascii="Times New Roman" w:hAnsi="Times New Roman" w:cs="Times New Roman"/>
+          <w:color w:val="auto"/>
+          <w:sz w:val="22"/>
+          <w:szCs w:val="22"/>
+        </w:rPr>
+      </w:pPr>
+      <w:r>
+        <w:rPr>
           <w:rFonts w:ascii="Times New Roman" w:hAnsi="Times New Roman" w:cs="Times New Roman"/>
           <w:b/>
           <w:bCs/>
@@ -1461,20 +1508,6 @@
         </w:rPr>
         <w:t>; selected to represent Tongji University</w:t>
       </w:r>
-    </w:p>
-    <w:p>
-      <w:pPr>
-        <w:pStyle w:val="Body"/>
-        <w:tabs>
-          <w:tab w:val="right" w:pos="10086"/>
-        </w:tabs>
-        <w:rPr>
-          <w:rFonts w:ascii="Times New Roman" w:hAnsi="Times New Roman" w:cs="Times New Roman"/>
-          <w:color w:val="auto"/>
-          <w:sz w:val="22"/>
-          <w:szCs w:val="22"/>
-        </w:rPr>
-      </w:pPr>
     </w:p>
     <w:p>
       <w:pPr>

</xml_diff>